<commit_message>
docs: generate surat pernyataan dan integritas lengkap NIK NUPTK untuk Lab Maya dan MPI
</commit_message>
<xml_diff>
--- a/lab/lab-maya/perakitan-komputer/SIAP KIRIM/SURAT_PERNYATAAN_DAN_INTEGRITAS_PESERTA.docx
+++ b/lab/lab-maya/perakitan-komputer/SIAP KIRIM/SURAT_PERNYATAAN_DAN_INTEGRITAS_PESERTA.docx
@@ -136,15 +136,8 @@
             </w:tcMar>
           </w:tcPr>
           <w:p>
-            <w:pPr>
-              <w:spacing w:after="40"/>
-            </w:pPr>
             <w:r>
-              <w:rPr>
-                <w:rFonts w:ascii="Arial" w:hAnsi="Arial"/>
-                <w:sz w:val="20"/>
-              </w:rPr>
-              <w:t>: .....................................................................................</w:t>
+              <w:t>: 3524162608910001</w:t>
             </w:r>
           </w:p>
         </w:tc>
@@ -185,15 +178,8 @@
             </w:tcMar>
           </w:tcPr>
           <w:p>
-            <w:pPr>
-              <w:spacing w:after="40"/>
-            </w:pPr>
             <w:r>
-              <w:rPr>
-                <w:rFonts w:ascii="Arial" w:hAnsi="Arial"/>
-                <w:sz w:val="20"/>
-              </w:rPr>
-              <w:t>: .....................................................................................</w:t>
+              <w:t>: 9158769670130183</w:t>
             </w:r>
           </w:p>
         </w:tc>
@@ -332,15 +318,8 @@
             </w:tcMar>
           </w:tcPr>
           <w:p>
-            <w:pPr>
-              <w:spacing w:after="40"/>
-            </w:pPr>
             <w:r>
-              <w:rPr>
-                <w:rFonts w:ascii="Arial" w:hAnsi="Arial"/>
-                <w:sz w:val="20"/>
-              </w:rPr>
-              <w:t>: .....................................................................................</w:t>
+              <w:t>: 08158885508</w:t>
             </w:r>
           </w:p>
         </w:tc>
@@ -381,15 +360,8 @@
             </w:tcMar>
           </w:tcPr>
           <w:p>
-            <w:pPr>
-              <w:spacing w:after="40"/>
-            </w:pPr>
             <w:r>
-              <w:rPr>
-                <w:rFonts w:ascii="Arial" w:hAnsi="Arial"/>
-                <w:sz w:val="20"/>
-              </w:rPr>
-              <w:t>: chanif.fanani@gmail.com</w:t>
+              <w:t>: chanifuddin@gmail.com</w:t>
             </w:r>
           </w:p>
         </w:tc>

</xml_diff>